<commit_message>
docs: deploy XCN from delivered chart archive
</commit_message>
<xml_diff>
--- a/docs/manuals/XCN-核心网产品说明书-V1.0.docx
+++ b/docs/manuals/XCN-核心网产品说明书-V1.0.docx
@@ -29,7 +29,7 @@
           <w:b/>
           <w:i w:val="0"/>
         </w:rPr>
-        <w:t>纯软件部署说明｜V1.0（修订版）｜2026-10-22</w:t>
+        <w:t>纯软件部署说明｜V1.0（修订版）｜2026-10-23</w:t>
       </w:r>
       <w:r>
         <w:rPr>
@@ -46,7 +46,7 @@
           <w:b w:val="0"/>
           <w:i w:val="0"/>
         </w:rPr>
-        <w:t xml:space="preserve">适用版本：Open5GS 2.7.7，XCN Helm Chart 0.1.0。部署包路径为 </w:t>
+        <w:t xml:space="preserve">适用版本：Open5GS 2.7.7，XCN Helm Chart 0.1.0。实际交付内容为相关容器镜像及 Helm Chart 包 </w:t>
       </w:r>
       <w:r>
         <w:rPr>
@@ -54,7 +54,7 @@
           <w:b w:val="0"/>
           <w:i w:val="0"/>
         </w:rPr>
-        <w:t>helm/xcn</w:t>
+        <w:t>xcn.tgz</w:t>
       </w:r>
       <w:r>
         <w:rPr>
@@ -62,7 +62,7 @@
           <w:b w:val="0"/>
           <w:i w:val="0"/>
         </w:rPr>
-        <w:t xml:space="preserve">，参数以该版本的 </w:t>
+        <w:t xml:space="preserve">，部署参数以交付包中的配置为准，包版本可通过 </w:t>
       </w:r>
       <w:r>
         <w:rPr>
@@ -70,7 +70,7 @@
           <w:b w:val="0"/>
           <w:i w:val="0"/>
         </w:rPr>
-        <w:t>values.yaml</w:t>
+        <w:t>helm show chart ./xcn.tgz</w:t>
       </w:r>
       <w:r>
         <w:rPr>
@@ -78,7 +78,7 @@
           <w:b w:val="0"/>
           <w:i w:val="0"/>
         </w:rPr>
-        <w:t xml:space="preserve"> 和模板为准。</w:t>
+        <w:t xml:space="preserve"> 查看。</w:t>
       </w:r>
     </w:p>
     <w:p>
@@ -3139,23 +3139,7 @@
           <w:b w:val="0"/>
           <w:i w:val="0"/>
         </w:rPr>
-        <w:t xml:space="preserve">当前 Chart 未提供通用 PLMN／TAC values 参数；更换时需同步调整 </w:t>
-      </w:r>
-      <w:r>
-        <w:rPr>
-          <w:rFonts w:ascii="Consolas" w:hAnsi="Consolas" w:eastAsia="Microsoft YaHei"/>
-          <w:b w:val="0"/>
-          <w:i w:val="0"/>
-        </w:rPr>
-        <w:t>templates/config.yaml</w:t>
-      </w:r>
-      <w:r>
-        <w:rPr>
-          <w:rFonts w:ascii="Arial" w:hAnsi="Arial" w:eastAsia="Microsoft YaHei"/>
-          <w:b w:val="0"/>
-          <w:i w:val="0"/>
-        </w:rPr>
-        <w:t xml:space="preserve"> 中 NRF、AMF 及相关网元配置，重新部署验证。UE 容量模板值 </w:t>
+        <w:t xml:space="preserve">当前 Chart 未提供通用 PLMN／TAC values 参数，部署时采用交付包中的预置配置；如需更换，应提供相应配置的新版 Chart 包。UE 容量模板值 </w:t>
       </w:r>
       <w:r>
         <w:rPr>
@@ -3208,7 +3192,55 @@
           <w:b w:val="0"/>
           <w:i w:val="0"/>
         </w:rPr>
-        <w:t>在管理终端进入部署包目录：</w:t>
+        <w:t xml:space="preserve">交付的 Chart 经 </w:t>
+      </w:r>
+      <w:r>
+        <w:rPr>
+          <w:rFonts w:ascii="Consolas" w:hAnsi="Consolas" w:eastAsia="Microsoft YaHei"/>
+          <w:b w:val="0"/>
+          <w:i w:val="0"/>
+        </w:rPr>
+        <w:t>helm package xcn</w:t>
+      </w:r>
+      <w:r>
+        <w:rPr>
+          <w:rFonts w:ascii="Arial" w:hAnsi="Arial" w:eastAsia="Microsoft YaHei"/>
+          <w:b w:val="0"/>
+          <w:i w:val="0"/>
+        </w:rPr>
+        <w:t xml:space="preserve"> 打包，以 </w:t>
+      </w:r>
+      <w:r>
+        <w:rPr>
+          <w:rFonts w:ascii="Consolas" w:hAnsi="Consolas" w:eastAsia="Microsoft YaHei"/>
+          <w:b w:val="0"/>
+          <w:i w:val="0"/>
+        </w:rPr>
+        <w:t>xcn.tgz</w:t>
+      </w:r>
+      <w:r>
+        <w:rPr>
+          <w:rFonts w:ascii="Arial" w:hAnsi="Arial" w:eastAsia="Microsoft YaHei"/>
+          <w:b w:val="0"/>
+          <w:i w:val="0"/>
+        </w:rPr>
+        <w:t xml:space="preserve"> 文件提供；镜像包括 XCN 运行镜像、WebUI 和 MongoDB，VPP/memif 模式另需 VPP 镜像。以下以交付文件放在 </w:t>
+      </w:r>
+      <w:r>
+        <w:rPr>
+          <w:rFonts w:ascii="Consolas" w:hAnsi="Consolas" w:eastAsia="Microsoft YaHei"/>
+          <w:b w:val="0"/>
+          <w:i w:val="0"/>
+        </w:rPr>
+        <w:t>/opt/xcn</w:t>
+      </w:r>
+      <w:r>
+        <w:rPr>
+          <w:rFonts w:ascii="Arial" w:hAnsi="Arial" w:eastAsia="Microsoft YaHei"/>
+          <w:b w:val="0"/>
+          <w:i w:val="0"/>
+        </w:rPr>
+        <w:t xml:space="preserve"> 为例，离线归档的目录示例为：</w:t>
       </w:r>
     </w:p>
     <w:p>
@@ -3223,9 +3255,64 @@
           <w:color w:val="203B56"/>
           <w:sz w:val="16"/>
         </w:rPr>
-        <w:t>cd /home/xiazhangtao/code/open5gs</w:t>
+        <w:t>/opt/xcn/</w:t>
         <w:br/>
-        <w:t>helm show chart helm/xcn</w:t>
+        <w:t>├── xcn.tgz</w:t>
+        <w:br/>
+        <w:t>└── images/</w:t>
+        <w:br/>
+        <w:t xml:space="preserve">    ├── xcn-runtime.tar</w:t>
+        <w:br/>
+        <w:t xml:space="preserve">    ├── xcn-webui.tar</w:t>
+        <w:br/>
+        <w:t xml:space="preserve">    ├── mongo.tar</w:t>
+        <w:br/>
+        <w:t xml:space="preserve">    └── vpp.tar</w:t>
+      </w:r>
+    </w:p>
+    <w:p>
+      <w:r>
+        <w:rPr>
+          <w:rFonts w:ascii="Arial" w:hAnsi="Arial" w:eastAsia="Microsoft YaHei"/>
+          <w:b w:val="0"/>
+          <w:i w:val="0"/>
+        </w:rPr>
+        <w:t xml:space="preserve">在管理终端进入实际部署目录，检查 Chart 版本并导出默认参数供核对。Helm 直接读取 </w:t>
+      </w:r>
+      <w:r>
+        <w:rPr>
+          <w:rFonts w:ascii="Consolas" w:hAnsi="Consolas" w:eastAsia="Microsoft YaHei"/>
+          <w:b w:val="0"/>
+          <w:i w:val="0"/>
+        </w:rPr>
+        <w:t>xcn.tgz</w:t>
+      </w:r>
+      <w:r>
+        <w:rPr>
+          <w:rFonts w:ascii="Arial" w:hAnsi="Arial" w:eastAsia="Microsoft YaHei"/>
+          <w:b w:val="0"/>
+          <w:i w:val="0"/>
+        </w:rPr>
+        <w:t>，现场参数通过独立 values 文件覆盖：</w:t>
+      </w:r>
+    </w:p>
+    <w:p>
+      <w:pPr>
+        <w:spacing w:line="264" w:lineRule="auto" w:before="80" w:after="160"/>
+        <w:ind w:left="85" w:right="57"/>
+        <w:shd w:fill="F0F4F8"/>
+      </w:pPr>
+      <w:r>
+        <w:rPr>
+          <w:rFonts w:ascii="Consolas" w:hAnsi="Consolas" w:eastAsia="Microsoft YaHei"/>
+          <w:color w:val="203B56"/>
+          <w:sz w:val="16"/>
+        </w:rPr>
+        <w:t>cd /opt/xcn</w:t>
+        <w:br/>
+        <w:t>helm show chart ./xcn.tgz</w:t>
+        <w:br/>
+        <w:t>helm show values ./xcn.tgz &gt; /tmp/xcn-default-values.yaml</w:t>
       </w:r>
     </w:p>
     <w:p>
@@ -3489,11 +3576,11 @@
           <w:color w:val="203B56"/>
           <w:sz w:val="16"/>
         </w:rPr>
-        <w:t>helm lint helm/xcn -f /tmp/xcn-site-tun.yaml</w:t>
+        <w:t>helm lint ./xcn.tgz -f /tmp/xcn-site-tun.yaml</w:t>
         <w:br/>
         <w:t>umask 077</w:t>
         <w:br/>
-        <w:t>helm template xcn helm/xcn -n xcn \</w:t>
+        <w:t>helm template xcn ./xcn.tgz -n xcn \</w:t>
         <w:br/>
         <w:t xml:space="preserve">  -f /tmp/xcn-site-tun.yaml &gt; /tmp/xcn-rendered-tun.yaml</w:t>
       </w:r>
@@ -3520,7 +3607,7 @@
           <w:color w:val="203B56"/>
           <w:sz w:val="16"/>
         </w:rPr>
-        <w:t>helm install xcn helm/xcn -n xcn --create-namespace \</w:t>
+        <w:t>helm install xcn ./xcn.tgz -n xcn --create-namespace \</w:t>
         <w:br/>
         <w:t xml:space="preserve">  -f /tmp/xcn-site-tun.yaml \</w:t>
         <w:br/>
@@ -3719,19 +3806,19 @@
           <w:color w:val="203B56"/>
           <w:sz w:val="16"/>
         </w:rPr>
-        <w:t>helm lint helm/xcn -f /tmp/xcn-site-tun.yaml \</w:t>
+        <w:t>helm lint ./xcn.tgz -f /tmp/xcn-site-tun.yaml \</w:t>
         <w:br/>
         <w:t xml:space="preserve">  -f /tmp/xcn-site-memif.yaml</w:t>
         <w:br/>
         <w:t>umask 077</w:t>
         <w:br/>
-        <w:t>helm template xcn helm/xcn -n xcn \</w:t>
+        <w:t>helm template xcn ./xcn.tgz -n xcn \</w:t>
         <w:br/>
         <w:t xml:space="preserve">  -f /tmp/xcn-site-tun.yaml -f /tmp/xcn-site-memif.yaml \</w:t>
         <w:br/>
         <w:t xml:space="preserve">  &gt; /tmp/xcn-rendered-memif.yaml</w:t>
         <w:br/>
-        <w:t>helm install xcn helm/xcn -n xcn --create-namespace \</w:t>
+        <w:t>helm install xcn ./xcn.tgz -n xcn --create-namespace \</w:t>
         <w:br/>
         <w:t xml:space="preserve">  -f /tmp/xcn-site-tun.yaml -f /tmp/xcn-site-memif.yaml \</w:t>
         <w:br/>
@@ -4672,7 +4759,23 @@
           <w:b w:val="0"/>
           <w:i w:val="0"/>
         </w:rPr>
-        <w:t>升级前保存实际 Release 参数和数据库备份。以下目录变量由本次操作创建，后续命令使用同一目录：</w:t>
+        <w:t xml:space="preserve">升级前保存原 </w:t>
+      </w:r>
+      <w:r>
+        <w:rPr>
+          <w:rFonts w:ascii="Consolas" w:hAnsi="Consolas" w:eastAsia="Microsoft YaHei"/>
+          <w:b w:val="0"/>
+          <w:i w:val="0"/>
+        </w:rPr>
+        <w:t>xcn.tgz</w:t>
+      </w:r>
+      <w:r>
+        <w:rPr>
+          <w:rFonts w:ascii="Arial" w:hAnsi="Arial" w:eastAsia="Microsoft YaHei"/>
+          <w:b w:val="0"/>
+          <w:i w:val="0"/>
+        </w:rPr>
+        <w:t>、实际 Release 参数和数据库备份。以下命令在部署目录执行，目录变量由本次操作创建，后续命令使用同一目录：</w:t>
       </w:r>
     </w:p>
     <w:p>
@@ -4693,6 +4796,8 @@
         <w:br/>
         <w:t>install -d -m 700 "$XCN_BACKUP_DIR"</w:t>
         <w:br/>
+        <w:t>cp ./xcn.tgz "$XCN_BACKUP_DIR/xcn.tgz"</w:t>
+        <w:br/>
         <w:t>helm get values xcn -n xcn --all &gt; "$XCN_BACKUP_DIR/values.yaml"</w:t>
         <w:br/>
         <w:t>kubectl -n xcn exec statefulset/xcn-mongodb -- \</w:t>
@@ -4711,7 +4816,23 @@
           <w:b w:val="0"/>
           <w:i w:val="0"/>
         </w:rPr>
-        <w:t xml:space="preserve">需要一致性备份时，先停止相关数据库写入。在已保存的 values 基础上修改形成 </w:t>
+        <w:t xml:space="preserve">需要一致性备份时，先停止相关数据库写入。完成备份后导入新版交付镜像，并用新版 </w:t>
+      </w:r>
+      <w:r>
+        <w:rPr>
+          <w:rFonts w:ascii="Consolas" w:hAnsi="Consolas" w:eastAsia="Microsoft YaHei"/>
+          <w:b w:val="0"/>
+          <w:i w:val="0"/>
+        </w:rPr>
+        <w:t>xcn.tgz</w:t>
+      </w:r>
+      <w:r>
+        <w:rPr>
+          <w:rFonts w:ascii="Arial" w:hAnsi="Arial" w:eastAsia="Microsoft YaHei"/>
+          <w:b w:val="0"/>
+          <w:i w:val="0"/>
+        </w:rPr>
+        <w:t xml:space="preserve"> 替换部署目录中的 Chart 包。在已保存的 values 基础上修改形成 </w:t>
       </w:r>
       <w:r>
         <w:rPr>
@@ -4727,7 +4848,7 @@
           <w:b w:val="0"/>
           <w:i w:val="0"/>
         </w:rPr>
-        <w:t>，保留原有镜像、密钥、地址、存储和用户面参数，再执行：</w:t>
+        <w:t>，保持现场密钥、地址、存储和用户面参数，按新版镜像更新 repository、tag，再执行：</w:t>
       </w:r>
     </w:p>
     <w:p>
@@ -4742,9 +4863,9 @@
           <w:color w:val="203B56"/>
           <w:sz w:val="16"/>
         </w:rPr>
-        <w:t>helm lint helm/xcn -f /tmp/xcn-approved-values.yaml</w:t>
+        <w:t>helm lint ./xcn.tgz -f /tmp/xcn-approved-values.yaml</w:t>
         <w:br/>
-        <w:t>helm upgrade xcn helm/xcn -n xcn \</w:t>
+        <w:t>helm upgrade xcn ./xcn.tgz -n xcn \</w:t>
         <w:br/>
         <w:t xml:space="preserve">  -f /tmp/xcn-approved-values.yaml --wait --timeout 10m</w:t>
       </w:r>
@@ -4821,7 +4942,7 @@
         <w:color w:val="58708B"/>
         <w:sz w:val="16"/>
       </w:rPr>
-      <w:t xml:space="preserve">2026-10-22  |  第 </w:t>
+      <w:t xml:space="preserve">2026-10-23  |  第 </w:t>
     </w:r>
     <w:r>
       <w:rPr>

</xml_diff>